<commit_message>
@ feat: nuevas funcionalidades, perfil de usuario, estadisticas y tests
- Backend: gestion de horarios laborales en citas, estadisticas de
  empleado, conteo de no-shows, CRUD de usuarios y validacion de registro.
- Frontend: perfil de usuario, CRUD de usuarios en admin, footer y
  mejoras de UI/accesibilidad en paneles y formularios.
- Tests: specs de auth, citas y usuarios (34 backend, 8 frontend en verde).
- CI: workflow de GitHub Actions (lint + tests + build).
- Docs: memoria del proyecto.

Co-Authored-By: Claude Opus 4.8 <noreply@anthropic.com>
@
</commit_message>
<xml_diff>
--- a/Plantilla memoria final con anotaciones.docx
+++ b/Plantilla memoria final con anotaciones.docx
@@ -1,6 +1,6 @@
 
 <file path=word/document.xml><?xml version="1.0" encoding="utf-8"?>
-<w:document xmlns:wpc="http://schemas.microsoft.com/office/word/2010/wordprocessingCanvas" xmlns:cx="http://schemas.microsoft.com/office/drawing/2014/chartex" xmlns:cx1="http://schemas.microsoft.com/office/drawing/2015/9/8/chartex" xmlns:cx2="http://schemas.microsoft.com/office/drawing/2015/10/21/chartex" xmlns:cx3="http://schemas.microsoft.com/office/drawing/2016/5/9/chartex" xmlns:cx4="http://schemas.microsoft.com/office/drawing/2016/5/10/chartex" xmlns:cx5="http://schemas.microsoft.com/office/drawing/2016/5/11/chartex" xmlns:cx6="http://schemas.microsoft.com/office/drawing/2016/5/12/chartex" xmlns:cx7="http://schemas.microsoft.com/office/drawing/2016/5/13/chartex" xmlns:cx8="http://schemas.microsoft.com/office/drawing/2016/5/14/chartex" xmlns:mc="http://schemas.openxmlformats.org/markup-compatibility/2006" xmlns:aink="http://schemas.microsoft.com/office/drawing/2016/ink" xmlns:am3d="http://schemas.microsoft.com/office/drawing/2017/model3d" xmlns:o="urn:schemas-microsoft-com:office:office" xmlns:oel="http://schemas.microsoft.com/office/2019/extlst" xmlns:r="http://schemas.openxmlformats.org/officeDocument/2006/relationships" xmlns:m="http://schemas.openxmlformats.org/officeDocument/2006/math" xmlns:v="urn:schemas-microsoft-com:vml" xmlns:wp14="http://schemas.microsoft.com/office/word/2010/wordprocessingDrawing" xmlns:wp="http://schemas.openxmlformats.org/drawingml/2006/wordprocessingDrawing" xmlns:w10="urn:schemas-microsoft-com:office:word" xmlns:w="http://schemas.openxmlformats.org/wordprocessingml/2006/main" xmlns:w14="http://schemas.microsoft.com/office/word/2010/wordml" xmlns:w15="http://schemas.microsoft.com/office/word/2012/wordml" xmlns:w16cex="http://schemas.microsoft.com/office/word/2018/wordml/cex" xmlns:w16cid="http://schemas.microsoft.com/office/word/2016/wordml/cid" xmlns:w16="http://schemas.microsoft.com/office/word/2018/wordml" xmlns:w16du="http://schemas.microsoft.com/office/word/2023/wordml/word16du" xmlns:w16sdtdh="http://schemas.microsoft.com/office/word/2020/wordml/sdtdatahash" xmlns:w16se="http://schemas.microsoft.com/office/word/2015/wordml/symex" xmlns:wpg="http://schemas.microsoft.com/office/word/2010/wordprocessingGroup" xmlns:wpi="http://schemas.microsoft.com/office/word/2010/wordprocessingInk" xmlns:wne="http://schemas.microsoft.com/office/word/2006/wordml" xmlns:wps="http://schemas.microsoft.com/office/word/2010/wordprocessingShape" mc:Ignorable="w14 w15 w16se w16cid w16 w16cex w16sdtdh wp14">
+<w:document xmlns:wpc="http://schemas.microsoft.com/office/word/2010/wordprocessingCanvas" xmlns:cx="http://schemas.microsoft.com/office/drawing/2014/chartex" xmlns:cx1="http://schemas.microsoft.com/office/drawing/2015/9/8/chartex" xmlns:cx2="http://schemas.microsoft.com/office/drawing/2015/10/21/chartex" xmlns:cx3="http://schemas.microsoft.com/office/drawing/2016/5/9/chartex" xmlns:cx4="http://schemas.microsoft.com/office/drawing/2016/5/10/chartex" xmlns:cx5="http://schemas.microsoft.com/office/drawing/2016/5/11/chartex" xmlns:cx6="http://schemas.microsoft.com/office/drawing/2016/5/12/chartex" xmlns:cx7="http://schemas.microsoft.com/office/drawing/2016/5/13/chartex" xmlns:cx8="http://schemas.microsoft.com/office/drawing/2016/5/14/chartex" xmlns:mc="http://schemas.openxmlformats.org/markup-compatibility/2006" xmlns:aink="http://schemas.microsoft.com/office/drawing/2016/ink" xmlns:am3d="http://schemas.microsoft.com/office/drawing/2017/model3d" xmlns:o="urn:schemas-microsoft-com:office:office" xmlns:oel="http://schemas.microsoft.com/office/2019/extlst" xmlns:r="http://schemas.openxmlformats.org/officeDocument/2006/relationships" xmlns:m="http://schemas.openxmlformats.org/officeDocument/2006/math" xmlns:v="urn:schemas-microsoft-com:vml" xmlns:wp14="http://schemas.microsoft.com/office/word/2010/wordprocessingDrawing" xmlns:wp="http://schemas.openxmlformats.org/drawingml/2006/wordprocessingDrawing" xmlns:w10="urn:schemas-microsoft-com:office:word" xmlns:w="http://schemas.openxmlformats.org/wordprocessingml/2006/main" xmlns:w14="http://schemas.microsoft.com/office/word/2010/wordml" xmlns:w15="http://schemas.microsoft.com/office/word/2012/wordml" xmlns:w16cex="http://schemas.microsoft.com/office/word/2018/wordml/cex" xmlns:w16cid="http://schemas.microsoft.com/office/word/2016/wordml/cid" xmlns:w16="http://schemas.microsoft.com/office/word/2018/wordml" xmlns:w16du="http://schemas.microsoft.com/office/word/2023/wordml/word16du" xmlns:w16sdtdh="http://schemas.microsoft.com/office/word/2020/wordml/sdtdatahash" xmlns:w16sdtfl="http://schemas.microsoft.com/office/word/2024/wordml/sdtformatlock" xmlns:w16se="http://schemas.microsoft.com/office/word/2015/wordml/symex" xmlns:wpg="http://schemas.microsoft.com/office/word/2010/wordprocessingGroup" xmlns:wpi="http://schemas.microsoft.com/office/word/2010/wordprocessingInk" xmlns:wne="http://schemas.microsoft.com/office/word/2006/wordml" xmlns:wps="http://schemas.microsoft.com/office/word/2010/wordprocessingShape" mc:Ignorable="w14 w15 w16se w16cid w16 w16cex w16sdtdh w16sdtfl w16du wp14">
   <w:body>
     <w:p>
       <w:pPr>
@@ -22,7 +22,7 @@
           <w:lang w:eastAsia="es-ES"/>
         </w:rPr>
         <w:drawing>
-          <wp:anchor distT="0" distB="0" distL="114300" distR="114300" simplePos="0" relativeHeight="251658240" behindDoc="0" locked="0" layoutInCell="1" allowOverlap="1">
+          <wp:anchor distT="0" distB="0" distL="114300" distR="114300" simplePos="0" relativeHeight="251658240" behindDoc="0" locked="0" layoutInCell="1" allowOverlap="1" wp14:anchorId="4EA20B8F" wp14:editId="39A239D4">
             <wp:simplePos x="0" y="0"/>
             <wp:positionH relativeFrom="column">
               <wp:posOffset>98425</wp:posOffset>
@@ -163,25 +163,7 @@
           <w:sz w:val="20"/>
           <w:szCs w:val="20"/>
         </w:rPr>
-        <w:t xml:space="preserve">30100  </w:t>
-      </w:r>
-      <w:proofErr w:type="spellStart"/>
-      <w:r>
-        <w:rPr>
-          <w:rFonts w:cs="Arial"/>
-          <w:sz w:val="20"/>
-          <w:szCs w:val="20"/>
-        </w:rPr>
-        <w:t>Espinardo</w:t>
-      </w:r>
-      <w:proofErr w:type="spellEnd"/>
-      <w:r>
-        <w:rPr>
-          <w:rFonts w:cs="Arial"/>
-          <w:sz w:val="20"/>
-          <w:szCs w:val="20"/>
-        </w:rPr>
-        <w:t xml:space="preserve"> – Murcia</w:t>
+        <w:t>30100  Espinardo – Murcia</w:t>
       </w:r>
     </w:p>
     <w:p>
@@ -382,7 +364,7 @@
           <w:rFonts w:cs="Arial"/>
           <w:szCs w:val="24"/>
         </w:rPr>
-        <w:t>&lt;Nombre y apellidos&gt;</w:t>
+        <w:t>Raúl García Segura</w:t>
       </w:r>
     </w:p>
     <w:p>
@@ -393,29 +375,6 @@
           <w:szCs w:val="24"/>
         </w:rPr>
       </w:pPr>
-      <w:r>
-        <w:rPr>
-          <w:rFonts w:cs="Arial"/>
-          <w:szCs w:val="24"/>
-        </w:rPr>
-        <w:t>&lt;Nombre y apellidos&gt;</w:t>
-      </w:r>
-    </w:p>
-    <w:p>
-      <w:pPr>
-        <w:jc w:val="center"/>
-        <w:rPr>
-          <w:rFonts w:cs="Arial"/>
-          <w:szCs w:val="24"/>
-        </w:rPr>
-      </w:pPr>
-      <w:r>
-        <w:rPr>
-          <w:rFonts w:cs="Arial"/>
-          <w:szCs w:val="24"/>
-        </w:rPr>
-        <w:t>&lt;Nombre y apellidos&gt;</w:t>
-      </w:r>
     </w:p>
     <w:p>
       <w:pPr>
@@ -426,23 +385,29 @@
           <w:szCs w:val="24"/>
         </w:rPr>
       </w:pPr>
-    </w:p>
-    <w:p>
-      <w:pPr>
-        <w:jc w:val="center"/>
+      <w:r>
         <w:rPr>
           <w:rFonts w:cs="Arial"/>
           <w:b/>
           <w:szCs w:val="24"/>
         </w:rPr>
-      </w:pPr>
-      <w:r>
-        <w:rPr>
-          <w:rFonts w:cs="Arial"/>
-          <w:b/>
+        <w:t xml:space="preserve">Profesor/a-coordinador/a: </w:t>
+      </w:r>
+    </w:p>
+    <w:p>
+      <w:pPr>
+        <w:jc w:val="center"/>
+        <w:rPr>
+          <w:rFonts w:cs="Arial"/>
           <w:szCs w:val="24"/>
         </w:rPr>
-        <w:t xml:space="preserve">Profesor/a-coordinador/a: </w:t>
+      </w:pPr>
+      <w:r>
+        <w:rPr>
+          <w:rFonts w:cs="Arial"/>
+          <w:szCs w:val="24"/>
+        </w:rPr>
+        <w:t>Fernando Domingo Ruiz Meseguer</w:t>
       </w:r>
     </w:p>
     <w:p>
@@ -458,79 +423,21 @@
           <w:rFonts w:cs="Arial"/>
           <w:szCs w:val="24"/>
         </w:rPr>
-        <w:t>&lt;Nombre y apellidos&gt;</w:t>
-      </w:r>
-    </w:p>
-    <w:p>
-      <w:pPr>
-        <w:jc w:val="center"/>
+        <w:t>Murcia</w:t>
+      </w:r>
+      <w:r>
         <w:rPr>
           <w:rFonts w:cs="Arial"/>
           <w:szCs w:val="24"/>
         </w:rPr>
-      </w:pPr>
+        <w:t xml:space="preserve">, </w:t>
+      </w:r>
       <w:r>
         <w:rPr>
           <w:rFonts w:cs="Arial"/>
           <w:szCs w:val="24"/>
         </w:rPr>
-        <w:t>Murcia</w:t>
-      </w:r>
-      <w:r>
-        <w:rPr>
-          <w:rFonts w:cs="Arial"/>
-          <w:szCs w:val="24"/>
-        </w:rPr>
-        <w:t xml:space="preserve">, </w:t>
-      </w:r>
-      <w:r>
-        <w:rPr>
-          <w:rFonts w:cs="Arial"/>
-          <w:szCs w:val="24"/>
-        </w:rPr>
-        <w:t>&lt;</w:t>
-      </w:r>
-      <w:r>
-        <w:rPr>
-          <w:rFonts w:cs="Arial"/>
-          <w:szCs w:val="24"/>
-        </w:rPr>
-        <w:t>Mes</w:t>
-      </w:r>
-      <w:r>
-        <w:rPr>
-          <w:rFonts w:cs="Arial"/>
-          <w:szCs w:val="24"/>
-        </w:rPr>
-        <w:t>&gt;</w:t>
-      </w:r>
-      <w:r>
-        <w:rPr>
-          <w:rFonts w:cs="Arial"/>
-          <w:szCs w:val="24"/>
-        </w:rPr>
-        <w:t xml:space="preserve"> de </w:t>
-      </w:r>
-      <w:r>
-        <w:rPr>
-          <w:rFonts w:cs="Arial"/>
-          <w:szCs w:val="24"/>
-        </w:rPr>
-        <w:t>&lt;</w:t>
-      </w:r>
-      <w:r>
-        <w:rPr>
-          <w:rFonts w:cs="Arial"/>
-          <w:szCs w:val="24"/>
-        </w:rPr>
-        <w:t>Año</w:t>
-      </w:r>
-      <w:r>
-        <w:rPr>
-          <w:rFonts w:cs="Arial"/>
-          <w:szCs w:val="24"/>
-        </w:rPr>
-        <w:t>&gt;</w:t>
+        <w:t>Junio de 2026</w:t>
       </w:r>
     </w:p>
     <w:p>
@@ -555,7 +462,7 @@
         </w:rPr>
         <w:lastRenderedPageBreak/>
         <w:drawing>
-          <wp:inline distT="0" distB="0" distL="0" distR="0">
+          <wp:inline distT="0" distB="0" distL="0" distR="0" wp14:anchorId="1F913B6E" wp14:editId="21A1B465">
             <wp:extent cx="846455" cy="300355"/>
             <wp:effectExtent l="19050" t="0" r="0" b="0"/>
             <wp:docPr id="6" name="Imagen 6" descr="Licencia de Creative Commons">
@@ -613,35 +520,7 @@
           <w:rPr>
             <w:rStyle w:val="Hipervnculo"/>
           </w:rPr>
-          <w:t xml:space="preserve">licencia de Creative </w:t>
-        </w:r>
-        <w:proofErr w:type="spellStart"/>
-        <w:r>
-          <w:rPr>
-            <w:rStyle w:val="Hipervnculo"/>
-          </w:rPr>
-          <w:t>Commons</w:t>
-        </w:r>
-        <w:proofErr w:type="spellEnd"/>
-        <w:r>
-          <w:rPr>
-            <w:rStyle w:val="Hipervnculo"/>
-          </w:rPr>
-          <w:t xml:space="preserve"> Reconocimiento-</w:t>
-        </w:r>
-        <w:proofErr w:type="spellStart"/>
-        <w:r>
-          <w:rPr>
-            <w:rStyle w:val="Hipervnculo"/>
-          </w:rPr>
-          <w:t>CompartirIgual</w:t>
-        </w:r>
-        <w:proofErr w:type="spellEnd"/>
-        <w:r>
-          <w:rPr>
-            <w:rStyle w:val="Hipervnculo"/>
-          </w:rPr>
-          <w:t xml:space="preserve"> 4.0 Internacional</w:t>
+          <w:t>licencia de Creative Commons Reconocimiento-CompartirIgual 4.0 Internacional</w:t>
         </w:r>
       </w:hyperlink>
       <w:r>
@@ -1672,7 +1551,6 @@
         <w:pStyle w:val="Ttulo2"/>
       </w:pPr>
       <w:bookmarkStart w:id="1" w:name="_Toc135770268"/>
-      <w:proofErr w:type="spellStart"/>
       <w:r>
         <w:t>K</w:t>
       </w:r>
@@ -1680,7 +1558,6 @@
         <w:t>jhkjh</w:t>
       </w:r>
       <w:bookmarkEnd w:id="1"/>
-      <w:proofErr w:type="spellEnd"/>
     </w:p>
     <w:p>
       <w:r>
@@ -1712,40 +1589,14 @@
       <w:r>
         <w:t xml:space="preserve">turnos profesorado </w:t>
       </w:r>
-      <w:proofErr w:type="spellStart"/>
-      <w:r>
-        <w:t>javascript</w:t>
-      </w:r>
-      <w:proofErr w:type="spellEnd"/>
-      <w:r>
-        <w:t xml:space="preserve"> angular </w:t>
-      </w:r>
-      <w:proofErr w:type="spellStart"/>
-      <w:r>
-        <w:t>php</w:t>
-      </w:r>
-      <w:proofErr w:type="spellEnd"/>
-      <w:r>
-        <w:t xml:space="preserve"> </w:t>
-      </w:r>
-      <w:proofErr w:type="spellStart"/>
-      <w:r>
-        <w:t>tailswind</w:t>
-      </w:r>
-      <w:proofErr w:type="spellEnd"/>
-      <w:r>
-        <w:t xml:space="preserve"> </w:t>
-      </w:r>
-      <w:proofErr w:type="spellStart"/>
+      <w:r>
+        <w:t xml:space="preserve">javascript angular php tailswind </w:t>
+      </w:r>
       <w:r>
         <w:t>b</w:t>
       </w:r>
       <w:r>
-        <w:t>ootstrap</w:t>
-      </w:r>
-      <w:proofErr w:type="spellEnd"/>
-      <w:r>
-        <w:t xml:space="preserve"> innovación</w:t>
+        <w:t>ootstrap innovación</w:t>
       </w:r>
       <w:r>
         <w:t xml:space="preserve"> desarrollo</w:t>
@@ -1763,15 +1614,7 @@
     </w:p>
     <w:p>
       <w:r>
-        <w:t xml:space="preserve">El proyecto surgió de la idea de </w:t>
-      </w:r>
-      <w:proofErr w:type="spellStart"/>
-      <w:r>
-        <w:t>fulanico</w:t>
-      </w:r>
-      <w:proofErr w:type="spellEnd"/>
-      <w:r>
-        <w:t xml:space="preserve"> que no sabía cómo organizar…</w:t>
+        <w:t>El proyecto surgió de la idea de fulanico que no sabía cómo organizar…</w:t>
       </w:r>
     </w:p>
     <w:p>
@@ -1848,15 +1691,7 @@
     </w:p>
     <w:p>
       <w:r>
-        <w:t xml:space="preserve">Aunque hemos instalado blablablá, finalmente hemos descartado esta opción porque blablablá y hemos hecho </w:t>
-      </w:r>
-      <w:proofErr w:type="spellStart"/>
-      <w:r>
-        <w:t>blablabal</w:t>
-      </w:r>
-      <w:proofErr w:type="spellEnd"/>
-      <w:r>
-        <w:t xml:space="preserve"> porque blablablá. Tuvimos dificultades en …</w:t>
+        <w:t>Aunque hemos instalado blablablá, finalmente hemos descartado esta opción porque blablablá y hemos hecho blablabal porque blablablá. Tuvimos dificultades en …</w:t>
       </w:r>
     </w:p>
     <w:p>
@@ -1875,13 +1710,8 @@
         <w:t>Borradores, prototipos</w:t>
       </w:r>
       <w:r>
-        <w:t xml:space="preserve"> en </w:t>
-      </w:r>
-      <w:proofErr w:type="spellStart"/>
-      <w:r>
-        <w:t>figma</w:t>
-      </w:r>
-      <w:proofErr w:type="spellEnd"/>
+        <w:t xml:space="preserve"> en figma</w:t>
+      </w:r>
       <w:r>
         <w:t xml:space="preserve"> (papel también), esquemas de bases de datos, capturas de pantallas, trocitos de código que os ha costado mucho, </w:t>
       </w:r>
@@ -1901,13 +1731,8 @@
         <w:t xml:space="preserve"> puede ser suficiente</w:t>
       </w:r>
       <w:r>
-        <w:t xml:space="preserve"> para describir para qué usáis determinado </w:t>
-      </w:r>
-      <w:proofErr w:type="spellStart"/>
-      <w:r>
-        <w:t>framework</w:t>
-      </w:r>
-      <w:proofErr w:type="spellEnd"/>
+        <w:t xml:space="preserve"> para describir para qué usáis determinado framework</w:t>
+      </w:r>
       <w:r>
         <w:t xml:space="preserve">. </w:t>
       </w:r>
@@ -1965,23 +1790,7 @@
         <w:t xml:space="preserve">tienen cabida las </w:t>
       </w:r>
       <w:r>
-        <w:t xml:space="preserve">conclusiones emocionales, habilidades sociales o </w:t>
-      </w:r>
-      <w:proofErr w:type="spellStart"/>
-      <w:r>
-        <w:t>soft</w:t>
-      </w:r>
-      <w:proofErr w:type="spellEnd"/>
-      <w:r>
-        <w:t xml:space="preserve"> </w:t>
-      </w:r>
-      <w:proofErr w:type="spellStart"/>
-      <w:r>
-        <w:t>skills</w:t>
-      </w:r>
-      <w:proofErr w:type="spellEnd"/>
-      <w:r>
-        <w:t xml:space="preserve">. </w:t>
+        <w:t xml:space="preserve">conclusiones emocionales, habilidades sociales o soft skills. </w:t>
       </w:r>
     </w:p>
     <w:p>
@@ -2025,15 +1834,7 @@
         </w:numPr>
       </w:pPr>
       <w:r>
-        <w:t xml:space="preserve">No hay una extensión mínima ni </w:t>
-      </w:r>
-      <w:proofErr w:type="gramStart"/>
-      <w:r>
-        <w:t>máxima</w:t>
-      </w:r>
-      <w:proofErr w:type="gramEnd"/>
-      <w:r>
-        <w:t xml:space="preserve"> pero algo razonable suele estar en torno a las 10-50 páginas. </w:t>
+        <w:t xml:space="preserve">No hay una extensión mínima ni máxima pero algo razonable suele estar en torno a las 10-50 páginas. </w:t>
       </w:r>
     </w:p>
     <w:p>
@@ -2057,15 +1858,7 @@
         </w:numPr>
       </w:pPr>
       <w:r>
-        <w:t xml:space="preserve">Las soluciones o tecnologías descartadas también son bienvenidas, explicad siempre por qué lo habéis descartado. Podéis poner capturas del </w:t>
-      </w:r>
-      <w:proofErr w:type="gramStart"/>
-      <w:r>
-        <w:t>proceso</w:t>
-      </w:r>
-      <w:proofErr w:type="gramEnd"/>
-      <w:r>
-        <w:t xml:space="preserve"> aunque no sea el resultado definitivo.</w:t>
+        <w:t>Las soluciones o tecnologías descartadas también son bienvenidas, explicad siempre por qué lo habéis descartado. Podéis poner capturas del proceso aunque no sea el resultado definitivo.</w:t>
       </w:r>
     </w:p>
     <w:p>
@@ -2108,7 +1901,7 @@
 </file>
 
 <file path=word/endnotes.xml><?xml version="1.0" encoding="utf-8"?>
-<w:endnotes xmlns:wpc="http://schemas.microsoft.com/office/word/2010/wordprocessingCanvas" xmlns:cx="http://schemas.microsoft.com/office/drawing/2014/chartex" xmlns:cx1="http://schemas.microsoft.com/office/drawing/2015/9/8/chartex" xmlns:cx2="http://schemas.microsoft.com/office/drawing/2015/10/21/chartex" xmlns:cx3="http://schemas.microsoft.com/office/drawing/2016/5/9/chartex" xmlns:cx4="http://schemas.microsoft.com/office/drawing/2016/5/10/chartex" xmlns:cx5="http://schemas.microsoft.com/office/drawing/2016/5/11/chartex" xmlns:cx6="http://schemas.microsoft.com/office/drawing/2016/5/12/chartex" xmlns:cx7="http://schemas.microsoft.com/office/drawing/2016/5/13/chartex" xmlns:cx8="http://schemas.microsoft.com/office/drawing/2016/5/14/chartex" xmlns:mc="http://schemas.openxmlformats.org/markup-compatibility/2006" xmlns:aink="http://schemas.microsoft.com/office/drawing/2016/ink" xmlns:am3d="http://schemas.microsoft.com/office/drawing/2017/model3d" xmlns:o="urn:schemas-microsoft-com:office:office" xmlns:oel="http://schemas.microsoft.com/office/2019/extlst" xmlns:r="http://schemas.openxmlformats.org/officeDocument/2006/relationships" xmlns:m="http://schemas.openxmlformats.org/officeDocument/2006/math" xmlns:v="urn:schemas-microsoft-com:vml" xmlns:wp14="http://schemas.microsoft.com/office/word/2010/wordprocessingDrawing" xmlns:wp="http://schemas.openxmlformats.org/drawingml/2006/wordprocessingDrawing" xmlns:w10="urn:schemas-microsoft-com:office:word" xmlns:w="http://schemas.openxmlformats.org/wordprocessingml/2006/main" xmlns:w14="http://schemas.microsoft.com/office/word/2010/wordml" xmlns:w15="http://schemas.microsoft.com/office/word/2012/wordml" xmlns:w16cex="http://schemas.microsoft.com/office/word/2018/wordml/cex" xmlns:w16cid="http://schemas.microsoft.com/office/word/2016/wordml/cid" xmlns:w16="http://schemas.microsoft.com/office/word/2018/wordml" xmlns:w16du="http://schemas.microsoft.com/office/word/2023/wordml/word16du" xmlns:w16sdtdh="http://schemas.microsoft.com/office/word/2020/wordml/sdtdatahash" xmlns:w16se="http://schemas.microsoft.com/office/word/2015/wordml/symex" xmlns:wpg="http://schemas.microsoft.com/office/word/2010/wordprocessingGroup" xmlns:wpi="http://schemas.microsoft.com/office/word/2010/wordprocessingInk" xmlns:wne="http://schemas.microsoft.com/office/word/2006/wordml" xmlns:wps="http://schemas.microsoft.com/office/word/2010/wordprocessingShape" mc:Ignorable="w14 w15 w16se w16cid w16 w16cex w16sdtdh wp14">
+<w:endnotes xmlns:wpc="http://schemas.microsoft.com/office/word/2010/wordprocessingCanvas" xmlns:cx="http://schemas.microsoft.com/office/drawing/2014/chartex" xmlns:cx1="http://schemas.microsoft.com/office/drawing/2015/9/8/chartex" xmlns:cx2="http://schemas.microsoft.com/office/drawing/2015/10/21/chartex" xmlns:cx3="http://schemas.microsoft.com/office/drawing/2016/5/9/chartex" xmlns:cx4="http://schemas.microsoft.com/office/drawing/2016/5/10/chartex" xmlns:cx5="http://schemas.microsoft.com/office/drawing/2016/5/11/chartex" xmlns:cx6="http://schemas.microsoft.com/office/drawing/2016/5/12/chartex" xmlns:cx7="http://schemas.microsoft.com/office/drawing/2016/5/13/chartex" xmlns:cx8="http://schemas.microsoft.com/office/drawing/2016/5/14/chartex" xmlns:mc="http://schemas.openxmlformats.org/markup-compatibility/2006" xmlns:aink="http://schemas.microsoft.com/office/drawing/2016/ink" xmlns:am3d="http://schemas.microsoft.com/office/drawing/2017/model3d" xmlns:o="urn:schemas-microsoft-com:office:office" xmlns:oel="http://schemas.microsoft.com/office/2019/extlst" xmlns:r="http://schemas.openxmlformats.org/officeDocument/2006/relationships" xmlns:m="http://schemas.openxmlformats.org/officeDocument/2006/math" xmlns:v="urn:schemas-microsoft-com:vml" xmlns:wp14="http://schemas.microsoft.com/office/word/2010/wordprocessingDrawing" xmlns:wp="http://schemas.openxmlformats.org/drawingml/2006/wordprocessingDrawing" xmlns:w10="urn:schemas-microsoft-com:office:word" xmlns:w="http://schemas.openxmlformats.org/wordprocessingml/2006/main" xmlns:w14="http://schemas.microsoft.com/office/word/2010/wordml" xmlns:w15="http://schemas.microsoft.com/office/word/2012/wordml" xmlns:w16cex="http://schemas.microsoft.com/office/word/2018/wordml/cex" xmlns:w16cid="http://schemas.microsoft.com/office/word/2016/wordml/cid" xmlns:w16="http://schemas.microsoft.com/office/word/2018/wordml" xmlns:w16du="http://schemas.microsoft.com/office/word/2023/wordml/word16du" xmlns:w16sdtdh="http://schemas.microsoft.com/office/word/2020/wordml/sdtdatahash" xmlns:w16sdtfl="http://schemas.microsoft.com/office/word/2024/wordml/sdtformatlock" xmlns:w16se="http://schemas.microsoft.com/office/word/2015/wordml/symex" xmlns:wpg="http://schemas.microsoft.com/office/word/2010/wordprocessingGroup" xmlns:wpi="http://schemas.microsoft.com/office/word/2010/wordprocessingInk" xmlns:wne="http://schemas.microsoft.com/office/word/2006/wordml" xmlns:wps="http://schemas.microsoft.com/office/word/2010/wordprocessingShape" mc:Ignorable="w14 w15 w16se w16cid w16 w16cex w16sdtdh w16sdtfl w16du wp14">
   <w:endnote w:type="separator" w:id="-1">
     <w:p>
       <w:pPr>
@@ -2133,7 +1926,7 @@
 </file>
 
 <file path=word/footer1.xml><?xml version="1.0" encoding="utf-8"?>
-<w:ftr xmlns:wpc="http://schemas.microsoft.com/office/word/2010/wordprocessingCanvas" xmlns:cx="http://schemas.microsoft.com/office/drawing/2014/chartex" xmlns:cx1="http://schemas.microsoft.com/office/drawing/2015/9/8/chartex" xmlns:cx2="http://schemas.microsoft.com/office/drawing/2015/10/21/chartex" xmlns:cx3="http://schemas.microsoft.com/office/drawing/2016/5/9/chartex" xmlns:cx4="http://schemas.microsoft.com/office/drawing/2016/5/10/chartex" xmlns:cx5="http://schemas.microsoft.com/office/drawing/2016/5/11/chartex" xmlns:cx6="http://schemas.microsoft.com/office/drawing/2016/5/12/chartex" xmlns:cx7="http://schemas.microsoft.com/office/drawing/2016/5/13/chartex" xmlns:cx8="http://schemas.microsoft.com/office/drawing/2016/5/14/chartex" xmlns:mc="http://schemas.openxmlformats.org/markup-compatibility/2006" xmlns:aink="http://schemas.microsoft.com/office/drawing/2016/ink" xmlns:am3d="http://schemas.microsoft.com/office/drawing/2017/model3d" xmlns:o="urn:schemas-microsoft-com:office:office" xmlns:oel="http://schemas.microsoft.com/office/2019/extlst" xmlns:r="http://schemas.openxmlformats.org/officeDocument/2006/relationships" xmlns:m="http://schemas.openxmlformats.org/officeDocument/2006/math" xmlns:v="urn:schemas-microsoft-com:vml" xmlns:wp14="http://schemas.microsoft.com/office/word/2010/wordprocessingDrawing" xmlns:wp="http://schemas.openxmlformats.org/drawingml/2006/wordprocessingDrawing" xmlns:w10="urn:schemas-microsoft-com:office:word" xmlns:w="http://schemas.openxmlformats.org/wordprocessingml/2006/main" xmlns:w14="http://schemas.microsoft.com/office/word/2010/wordml" xmlns:w15="http://schemas.microsoft.com/office/word/2012/wordml" xmlns:w16cex="http://schemas.microsoft.com/office/word/2018/wordml/cex" xmlns:w16cid="http://schemas.microsoft.com/office/word/2016/wordml/cid" xmlns:w16="http://schemas.microsoft.com/office/word/2018/wordml" xmlns:w16du="http://schemas.microsoft.com/office/word/2023/wordml/word16du" xmlns:w16sdtdh="http://schemas.microsoft.com/office/word/2020/wordml/sdtdatahash" xmlns:w16se="http://schemas.microsoft.com/office/word/2015/wordml/symex" xmlns:wpg="http://schemas.microsoft.com/office/word/2010/wordprocessingGroup" xmlns:wpi="http://schemas.microsoft.com/office/word/2010/wordprocessingInk" xmlns:wne="http://schemas.microsoft.com/office/word/2006/wordml" xmlns:wps="http://schemas.microsoft.com/office/word/2010/wordprocessingShape" mc:Ignorable="w14 w15 w16se w16cid w16 w16cex w16sdtdh wp14">
+<w:ftr xmlns:wpc="http://schemas.microsoft.com/office/word/2010/wordprocessingCanvas" xmlns:cx="http://schemas.microsoft.com/office/drawing/2014/chartex" xmlns:cx1="http://schemas.microsoft.com/office/drawing/2015/9/8/chartex" xmlns:cx2="http://schemas.microsoft.com/office/drawing/2015/10/21/chartex" xmlns:cx3="http://schemas.microsoft.com/office/drawing/2016/5/9/chartex" xmlns:cx4="http://schemas.microsoft.com/office/drawing/2016/5/10/chartex" xmlns:cx5="http://schemas.microsoft.com/office/drawing/2016/5/11/chartex" xmlns:cx6="http://schemas.microsoft.com/office/drawing/2016/5/12/chartex" xmlns:cx7="http://schemas.microsoft.com/office/drawing/2016/5/13/chartex" xmlns:cx8="http://schemas.microsoft.com/office/drawing/2016/5/14/chartex" xmlns:mc="http://schemas.openxmlformats.org/markup-compatibility/2006" xmlns:aink="http://schemas.microsoft.com/office/drawing/2016/ink" xmlns:am3d="http://schemas.microsoft.com/office/drawing/2017/model3d" xmlns:o="urn:schemas-microsoft-com:office:office" xmlns:oel="http://schemas.microsoft.com/office/2019/extlst" xmlns:r="http://schemas.openxmlformats.org/officeDocument/2006/relationships" xmlns:m="http://schemas.openxmlformats.org/officeDocument/2006/math" xmlns:v="urn:schemas-microsoft-com:vml" xmlns:wp14="http://schemas.microsoft.com/office/word/2010/wordprocessingDrawing" xmlns:wp="http://schemas.openxmlformats.org/drawingml/2006/wordprocessingDrawing" xmlns:w10="urn:schemas-microsoft-com:office:word" xmlns:w="http://schemas.openxmlformats.org/wordprocessingml/2006/main" xmlns:w14="http://schemas.microsoft.com/office/word/2010/wordml" xmlns:w15="http://schemas.microsoft.com/office/word/2012/wordml" xmlns:w16cex="http://schemas.microsoft.com/office/word/2018/wordml/cex" xmlns:w16cid="http://schemas.microsoft.com/office/word/2016/wordml/cid" xmlns:w16="http://schemas.microsoft.com/office/word/2018/wordml" xmlns:w16du="http://schemas.microsoft.com/office/word/2023/wordml/word16du" xmlns:w16sdtdh="http://schemas.microsoft.com/office/word/2020/wordml/sdtdatahash" xmlns:w16sdtfl="http://schemas.microsoft.com/office/word/2024/wordml/sdtformatlock" xmlns:w16se="http://schemas.microsoft.com/office/word/2015/wordml/symex" xmlns:wpg="http://schemas.microsoft.com/office/word/2010/wordprocessingGroup" xmlns:wpi="http://schemas.microsoft.com/office/word/2010/wordprocessingInk" xmlns:wne="http://schemas.microsoft.com/office/word/2006/wordml" xmlns:wps="http://schemas.microsoft.com/office/word/2010/wordprocessingShape" mc:Ignorable="w14 w15 w16se w16cid w16 w16cex w16sdtdh w16sdtfl w16du wp14">
   <w:sdt>
     <w:sdtPr>
       <w:id w:val="602966939"/>
@@ -2160,7 +1953,7 @@
 </file>
 
 <file path=word/footer2.xml><?xml version="1.0" encoding="utf-8"?>
-<w:ftr xmlns:wpc="http://schemas.microsoft.com/office/word/2010/wordprocessingCanvas" xmlns:cx="http://schemas.microsoft.com/office/drawing/2014/chartex" xmlns:cx1="http://schemas.microsoft.com/office/drawing/2015/9/8/chartex" xmlns:cx2="http://schemas.microsoft.com/office/drawing/2015/10/21/chartex" xmlns:cx3="http://schemas.microsoft.com/office/drawing/2016/5/9/chartex" xmlns:cx4="http://schemas.microsoft.com/office/drawing/2016/5/10/chartex" xmlns:cx5="http://schemas.microsoft.com/office/drawing/2016/5/11/chartex" xmlns:cx6="http://schemas.microsoft.com/office/drawing/2016/5/12/chartex" xmlns:cx7="http://schemas.microsoft.com/office/drawing/2016/5/13/chartex" xmlns:cx8="http://schemas.microsoft.com/office/drawing/2016/5/14/chartex" xmlns:mc="http://schemas.openxmlformats.org/markup-compatibility/2006" xmlns:aink="http://schemas.microsoft.com/office/drawing/2016/ink" xmlns:am3d="http://schemas.microsoft.com/office/drawing/2017/model3d" xmlns:o="urn:schemas-microsoft-com:office:office" xmlns:oel="http://schemas.microsoft.com/office/2019/extlst" xmlns:r="http://schemas.openxmlformats.org/officeDocument/2006/relationships" xmlns:m="http://schemas.openxmlformats.org/officeDocument/2006/math" xmlns:v="urn:schemas-microsoft-com:vml" xmlns:wp14="http://schemas.microsoft.com/office/word/2010/wordprocessingDrawing" xmlns:wp="http://schemas.openxmlformats.org/drawingml/2006/wordprocessingDrawing" xmlns:w10="urn:schemas-microsoft-com:office:word" xmlns:w="http://schemas.openxmlformats.org/wordprocessingml/2006/main" xmlns:w14="http://schemas.microsoft.com/office/word/2010/wordml" xmlns:w15="http://schemas.microsoft.com/office/word/2012/wordml" xmlns:w16cex="http://schemas.microsoft.com/office/word/2018/wordml/cex" xmlns:w16cid="http://schemas.microsoft.com/office/word/2016/wordml/cid" xmlns:w16="http://schemas.microsoft.com/office/word/2018/wordml" xmlns:w16du="http://schemas.microsoft.com/office/word/2023/wordml/word16du" xmlns:w16sdtdh="http://schemas.microsoft.com/office/word/2020/wordml/sdtdatahash" xmlns:w16se="http://schemas.microsoft.com/office/word/2015/wordml/symex" xmlns:wpg="http://schemas.microsoft.com/office/word/2010/wordprocessingGroup" xmlns:wpi="http://schemas.microsoft.com/office/word/2010/wordprocessingInk" xmlns:wne="http://schemas.microsoft.com/office/word/2006/wordml" xmlns:wps="http://schemas.microsoft.com/office/word/2010/wordprocessingShape" mc:Ignorable="w14 w15 w16se w16cid w16 w16cex w16sdtdh wp14">
+<w:ftr xmlns:wpc="http://schemas.microsoft.com/office/word/2010/wordprocessingCanvas" xmlns:cx="http://schemas.microsoft.com/office/drawing/2014/chartex" xmlns:cx1="http://schemas.microsoft.com/office/drawing/2015/9/8/chartex" xmlns:cx2="http://schemas.microsoft.com/office/drawing/2015/10/21/chartex" xmlns:cx3="http://schemas.microsoft.com/office/drawing/2016/5/9/chartex" xmlns:cx4="http://schemas.microsoft.com/office/drawing/2016/5/10/chartex" xmlns:cx5="http://schemas.microsoft.com/office/drawing/2016/5/11/chartex" xmlns:cx6="http://schemas.microsoft.com/office/drawing/2016/5/12/chartex" xmlns:cx7="http://schemas.microsoft.com/office/drawing/2016/5/13/chartex" xmlns:cx8="http://schemas.microsoft.com/office/drawing/2016/5/14/chartex" xmlns:mc="http://schemas.openxmlformats.org/markup-compatibility/2006" xmlns:aink="http://schemas.microsoft.com/office/drawing/2016/ink" xmlns:am3d="http://schemas.microsoft.com/office/drawing/2017/model3d" xmlns:o="urn:schemas-microsoft-com:office:office" xmlns:oel="http://schemas.microsoft.com/office/2019/extlst" xmlns:r="http://schemas.openxmlformats.org/officeDocument/2006/relationships" xmlns:m="http://schemas.openxmlformats.org/officeDocument/2006/math" xmlns:v="urn:schemas-microsoft-com:vml" xmlns:wp14="http://schemas.microsoft.com/office/word/2010/wordprocessingDrawing" xmlns:wp="http://schemas.openxmlformats.org/drawingml/2006/wordprocessingDrawing" xmlns:w10="urn:schemas-microsoft-com:office:word" xmlns:w="http://schemas.openxmlformats.org/wordprocessingml/2006/main" xmlns:w14="http://schemas.microsoft.com/office/word/2010/wordml" xmlns:w15="http://schemas.microsoft.com/office/word/2012/wordml" xmlns:w16cex="http://schemas.microsoft.com/office/word/2018/wordml/cex" xmlns:w16cid="http://schemas.microsoft.com/office/word/2016/wordml/cid" xmlns:w16="http://schemas.microsoft.com/office/word/2018/wordml" xmlns:w16du="http://schemas.microsoft.com/office/word/2023/wordml/word16du" xmlns:w16sdtdh="http://schemas.microsoft.com/office/word/2020/wordml/sdtdatahash" xmlns:w16sdtfl="http://schemas.microsoft.com/office/word/2024/wordml/sdtformatlock" xmlns:w16se="http://schemas.microsoft.com/office/word/2015/wordml/symex" xmlns:wpg="http://schemas.microsoft.com/office/word/2010/wordprocessingGroup" xmlns:wpi="http://schemas.microsoft.com/office/word/2010/wordprocessingInk" xmlns:wne="http://schemas.microsoft.com/office/word/2006/wordml" xmlns:wps="http://schemas.microsoft.com/office/word/2010/wordprocessingShape" mc:Ignorable="w14 w15 w16se w16cid w16 w16cex w16sdtdh w16sdtfl w16du wp14">
   <w:sdt>
     <w:sdtPr>
       <w:id w:val="602966943"/>
@@ -2208,7 +2001,7 @@
 </file>
 
 <file path=word/footnotes.xml><?xml version="1.0" encoding="utf-8"?>
-<w:footnotes xmlns:wpc="http://schemas.microsoft.com/office/word/2010/wordprocessingCanvas" xmlns:cx="http://schemas.microsoft.com/office/drawing/2014/chartex" xmlns:cx1="http://schemas.microsoft.com/office/drawing/2015/9/8/chartex" xmlns:cx2="http://schemas.microsoft.com/office/drawing/2015/10/21/chartex" xmlns:cx3="http://schemas.microsoft.com/office/drawing/2016/5/9/chartex" xmlns:cx4="http://schemas.microsoft.com/office/drawing/2016/5/10/chartex" xmlns:cx5="http://schemas.microsoft.com/office/drawing/2016/5/11/chartex" xmlns:cx6="http://schemas.microsoft.com/office/drawing/2016/5/12/chartex" xmlns:cx7="http://schemas.microsoft.com/office/drawing/2016/5/13/chartex" xmlns:cx8="http://schemas.microsoft.com/office/drawing/2016/5/14/chartex" xmlns:mc="http://schemas.openxmlformats.org/markup-compatibility/2006" xmlns:aink="http://schemas.microsoft.com/office/drawing/2016/ink" xmlns:am3d="http://schemas.microsoft.com/office/drawing/2017/model3d" xmlns:o="urn:schemas-microsoft-com:office:office" xmlns:oel="http://schemas.microsoft.com/office/2019/extlst" xmlns:r="http://schemas.openxmlformats.org/officeDocument/2006/relationships" xmlns:m="http://schemas.openxmlformats.org/officeDocument/2006/math" xmlns:v="urn:schemas-microsoft-com:vml" xmlns:wp14="http://schemas.microsoft.com/office/word/2010/wordprocessingDrawing" xmlns:wp="http://schemas.openxmlformats.org/drawingml/2006/wordprocessingDrawing" xmlns:w10="urn:schemas-microsoft-com:office:word" xmlns:w="http://schemas.openxmlformats.org/wordprocessingml/2006/main" xmlns:w14="http://schemas.microsoft.com/office/word/2010/wordml" xmlns:w15="http://schemas.microsoft.com/office/word/2012/wordml" xmlns:w16cex="http://schemas.microsoft.com/office/word/2018/wordml/cex" xmlns:w16cid="http://schemas.microsoft.com/office/word/2016/wordml/cid" xmlns:w16="http://schemas.microsoft.com/office/word/2018/wordml" xmlns:w16du="http://schemas.microsoft.com/office/word/2023/wordml/word16du" xmlns:w16sdtdh="http://schemas.microsoft.com/office/word/2020/wordml/sdtdatahash" xmlns:w16se="http://schemas.microsoft.com/office/word/2015/wordml/symex" xmlns:wpg="http://schemas.microsoft.com/office/word/2010/wordprocessingGroup" xmlns:wpi="http://schemas.microsoft.com/office/word/2010/wordprocessingInk" xmlns:wne="http://schemas.microsoft.com/office/word/2006/wordml" xmlns:wps="http://schemas.microsoft.com/office/word/2010/wordprocessingShape" mc:Ignorable="w14 w15 w16se w16cid w16 w16cex w16sdtdh wp14">
+<w:footnotes xmlns:wpc="http://schemas.microsoft.com/office/word/2010/wordprocessingCanvas" xmlns:cx="http://schemas.microsoft.com/office/drawing/2014/chartex" xmlns:cx1="http://schemas.microsoft.com/office/drawing/2015/9/8/chartex" xmlns:cx2="http://schemas.microsoft.com/office/drawing/2015/10/21/chartex" xmlns:cx3="http://schemas.microsoft.com/office/drawing/2016/5/9/chartex" xmlns:cx4="http://schemas.microsoft.com/office/drawing/2016/5/10/chartex" xmlns:cx5="http://schemas.microsoft.com/office/drawing/2016/5/11/chartex" xmlns:cx6="http://schemas.microsoft.com/office/drawing/2016/5/12/chartex" xmlns:cx7="http://schemas.microsoft.com/office/drawing/2016/5/13/chartex" xmlns:cx8="http://schemas.microsoft.com/office/drawing/2016/5/14/chartex" xmlns:mc="http://schemas.openxmlformats.org/markup-compatibility/2006" xmlns:aink="http://schemas.microsoft.com/office/drawing/2016/ink" xmlns:am3d="http://schemas.microsoft.com/office/drawing/2017/model3d" xmlns:o="urn:schemas-microsoft-com:office:office" xmlns:oel="http://schemas.microsoft.com/office/2019/extlst" xmlns:r="http://schemas.openxmlformats.org/officeDocument/2006/relationships" xmlns:m="http://schemas.openxmlformats.org/officeDocument/2006/math" xmlns:v="urn:schemas-microsoft-com:vml" xmlns:wp14="http://schemas.microsoft.com/office/word/2010/wordprocessingDrawing" xmlns:wp="http://schemas.openxmlformats.org/drawingml/2006/wordprocessingDrawing" xmlns:w10="urn:schemas-microsoft-com:office:word" xmlns:w="http://schemas.openxmlformats.org/wordprocessingml/2006/main" xmlns:w14="http://schemas.microsoft.com/office/word/2010/wordml" xmlns:w15="http://schemas.microsoft.com/office/word/2012/wordml" xmlns:w16cex="http://schemas.microsoft.com/office/word/2018/wordml/cex" xmlns:w16cid="http://schemas.microsoft.com/office/word/2016/wordml/cid" xmlns:w16="http://schemas.microsoft.com/office/word/2018/wordml" xmlns:w16du="http://schemas.microsoft.com/office/word/2023/wordml/word16du" xmlns:w16sdtdh="http://schemas.microsoft.com/office/word/2020/wordml/sdtdatahash" xmlns:w16sdtfl="http://schemas.microsoft.com/office/word/2024/wordml/sdtformatlock" xmlns:w16se="http://schemas.microsoft.com/office/word/2015/wordml/symex" xmlns:wpg="http://schemas.microsoft.com/office/word/2010/wordprocessingGroup" xmlns:wpi="http://schemas.microsoft.com/office/word/2010/wordprocessingInk" xmlns:wne="http://schemas.microsoft.com/office/word/2006/wordml" xmlns:wps="http://schemas.microsoft.com/office/word/2010/wordprocessingShape" mc:Ignorable="w14 w15 w16se w16cid w16 w16cex w16sdtdh w16sdtfl w16du wp14">
   <w:footnote w:type="separator" w:id="-1">
     <w:p>
       <w:pPr>
@@ -2233,7 +2026,7 @@
 </file>
 
 <file path=word/numbering.xml><?xml version="1.0" encoding="utf-8"?>
-<w:numbering xmlns:wpc="http://schemas.microsoft.com/office/word/2010/wordprocessingCanvas" xmlns:cx="http://schemas.microsoft.com/office/drawing/2014/chartex" xmlns:cx1="http://schemas.microsoft.com/office/drawing/2015/9/8/chartex" xmlns:cx2="http://schemas.microsoft.com/office/drawing/2015/10/21/chartex" xmlns:cx3="http://schemas.microsoft.com/office/drawing/2016/5/9/chartex" xmlns:cx4="http://schemas.microsoft.com/office/drawing/2016/5/10/chartex" xmlns:cx5="http://schemas.microsoft.com/office/drawing/2016/5/11/chartex" xmlns:cx6="http://schemas.microsoft.com/office/drawing/2016/5/12/chartex" xmlns:cx7="http://schemas.microsoft.com/office/drawing/2016/5/13/chartex" xmlns:cx8="http://schemas.microsoft.com/office/drawing/2016/5/14/chartex" xmlns:mc="http://schemas.openxmlformats.org/markup-compatibility/2006" xmlns:aink="http://schemas.microsoft.com/office/drawing/2016/ink" xmlns:am3d="http://schemas.microsoft.com/office/drawing/2017/model3d" xmlns:o="urn:schemas-microsoft-com:office:office" xmlns:oel="http://schemas.microsoft.com/office/2019/extlst" xmlns:r="http://schemas.openxmlformats.org/officeDocument/2006/relationships" xmlns:m="http://schemas.openxmlformats.org/officeDocument/2006/math" xmlns:v="urn:schemas-microsoft-com:vml" xmlns:wp14="http://schemas.microsoft.com/office/word/2010/wordprocessingDrawing" xmlns:wp="http://schemas.openxmlformats.org/drawingml/2006/wordprocessingDrawing" xmlns:w10="urn:schemas-microsoft-com:office:word" xmlns:w="http://schemas.openxmlformats.org/wordprocessingml/2006/main" xmlns:w14="http://schemas.microsoft.com/office/word/2010/wordml" xmlns:w15="http://schemas.microsoft.com/office/word/2012/wordml" xmlns:w16cex="http://schemas.microsoft.com/office/word/2018/wordml/cex" xmlns:w16cid="http://schemas.microsoft.com/office/word/2016/wordml/cid" xmlns:w16="http://schemas.microsoft.com/office/word/2018/wordml" xmlns:w16du="http://schemas.microsoft.com/office/word/2023/wordml/word16du" xmlns:w16sdtdh="http://schemas.microsoft.com/office/word/2020/wordml/sdtdatahash" xmlns:w16se="http://schemas.microsoft.com/office/word/2015/wordml/symex" xmlns:wpg="http://schemas.microsoft.com/office/word/2010/wordprocessingGroup" xmlns:wpi="http://schemas.microsoft.com/office/word/2010/wordprocessingInk" xmlns:wne="http://schemas.microsoft.com/office/word/2006/wordml" xmlns:wps="http://schemas.microsoft.com/office/word/2010/wordprocessingShape" mc:Ignorable="w14 w15 w16se w16cid w16 w16cex w16sdtdh wp14">
+<w:numbering xmlns:wpc="http://schemas.microsoft.com/office/word/2010/wordprocessingCanvas" xmlns:cx="http://schemas.microsoft.com/office/drawing/2014/chartex" xmlns:cx1="http://schemas.microsoft.com/office/drawing/2015/9/8/chartex" xmlns:cx2="http://schemas.microsoft.com/office/drawing/2015/10/21/chartex" xmlns:cx3="http://schemas.microsoft.com/office/drawing/2016/5/9/chartex" xmlns:cx4="http://schemas.microsoft.com/office/drawing/2016/5/10/chartex" xmlns:cx5="http://schemas.microsoft.com/office/drawing/2016/5/11/chartex" xmlns:cx6="http://schemas.microsoft.com/office/drawing/2016/5/12/chartex" xmlns:cx7="http://schemas.microsoft.com/office/drawing/2016/5/13/chartex" xmlns:cx8="http://schemas.microsoft.com/office/drawing/2016/5/14/chartex" xmlns:mc="http://schemas.openxmlformats.org/markup-compatibility/2006" xmlns:aink="http://schemas.microsoft.com/office/drawing/2016/ink" xmlns:am3d="http://schemas.microsoft.com/office/drawing/2017/model3d" xmlns:o="urn:schemas-microsoft-com:office:office" xmlns:oel="http://schemas.microsoft.com/office/2019/extlst" xmlns:r="http://schemas.openxmlformats.org/officeDocument/2006/relationships" xmlns:m="http://schemas.openxmlformats.org/officeDocument/2006/math" xmlns:v="urn:schemas-microsoft-com:vml" xmlns:wp14="http://schemas.microsoft.com/office/word/2010/wordprocessingDrawing" xmlns:wp="http://schemas.openxmlformats.org/drawingml/2006/wordprocessingDrawing" xmlns:w10="urn:schemas-microsoft-com:office:word" xmlns:w="http://schemas.openxmlformats.org/wordprocessingml/2006/main" xmlns:w14="http://schemas.microsoft.com/office/word/2010/wordml" xmlns:w15="http://schemas.microsoft.com/office/word/2012/wordml" xmlns:w16cex="http://schemas.microsoft.com/office/word/2018/wordml/cex" xmlns:w16cid="http://schemas.microsoft.com/office/word/2016/wordml/cid" xmlns:w16="http://schemas.microsoft.com/office/word/2018/wordml" xmlns:w16du="http://schemas.microsoft.com/office/word/2023/wordml/word16du" xmlns:w16sdtdh="http://schemas.microsoft.com/office/word/2020/wordml/sdtdatahash" xmlns:w16sdtfl="http://schemas.microsoft.com/office/word/2024/wordml/sdtformatlock" xmlns:w16se="http://schemas.microsoft.com/office/word/2015/wordml/symex" xmlns:wpg="http://schemas.microsoft.com/office/word/2010/wordprocessingGroup" xmlns:wpi="http://schemas.microsoft.com/office/word/2010/wordprocessingInk" xmlns:wne="http://schemas.microsoft.com/office/word/2006/wordml" xmlns:wps="http://schemas.microsoft.com/office/word/2010/wordprocessingShape" mc:Ignorable="w14 w15 w16se w16cid w16 w16cex w16sdtdh w16sdtfl w16du wp14">
   <w:abstractNum w:abstractNumId="0" w15:restartNumberingAfterBreak="0">
     <w:nsid w:val="2741303B"/>
     <w:multiLevelType w:val="hybridMultilevel"/>
@@ -2452,7 +2245,7 @@
 </file>
 
 <file path=word/styles.xml><?xml version="1.0" encoding="utf-8"?>
-<w:styles xmlns:mc="http://schemas.openxmlformats.org/markup-compatibility/2006" xmlns:r="http://schemas.openxmlformats.org/officeDocument/2006/relationships" xmlns:w="http://schemas.openxmlformats.org/wordprocessingml/2006/main" xmlns:w14="http://schemas.microsoft.com/office/word/2010/wordml" xmlns:w15="http://schemas.microsoft.com/office/word/2012/wordml" xmlns:w16cex="http://schemas.microsoft.com/office/word/2018/wordml/cex" xmlns:w16cid="http://schemas.microsoft.com/office/word/2016/wordml/cid" xmlns:w16="http://schemas.microsoft.com/office/word/2018/wordml" xmlns:w16sdtdh="http://schemas.microsoft.com/office/word/2020/wordml/sdtdatahash" xmlns:w16se="http://schemas.microsoft.com/office/word/2015/wordml/symex" mc:Ignorable="w14 w15 w16se w16cid w16 w16cex w16sdtdh">
+<w:styles xmlns:mc="http://schemas.openxmlformats.org/markup-compatibility/2006" xmlns:r="http://schemas.openxmlformats.org/officeDocument/2006/relationships" xmlns:w="http://schemas.openxmlformats.org/wordprocessingml/2006/main" xmlns:w14="http://schemas.microsoft.com/office/word/2010/wordml" xmlns:w15="http://schemas.microsoft.com/office/word/2012/wordml" xmlns:w16cex="http://schemas.microsoft.com/office/word/2018/wordml/cex" xmlns:w16cid="http://schemas.microsoft.com/office/word/2016/wordml/cid" xmlns:w16="http://schemas.microsoft.com/office/word/2018/wordml" xmlns:w16du="http://schemas.microsoft.com/office/word/2023/wordml/word16du" xmlns:w16sdtdh="http://schemas.microsoft.com/office/word/2020/wordml/sdtdatahash" xmlns:w16sdtfl="http://schemas.microsoft.com/office/word/2024/wordml/sdtformatlock" xmlns:w16se="http://schemas.microsoft.com/office/word/2015/wordml/symex" mc:Ignorable="w14 w15 w16se w16cid w16 w16cex w16sdtdh w16sdtfl w16du">
   <w:docDefaults>
     <w:rPrDefault>
       <w:rPr>

</xml_diff>